<commit_message>
Add verified CI evidence to report
</commit_message>
<xml_diff>
--- a/Lab_10/report/report.docx
+++ b/Lab_10/report/report.docx
@@ -1720,7 +1720,7 @@
     </w:p>
     <w:p>
       <w:r>
-        <w:t>Workflow запускається на push main і pull_request. Quality job використовує matrix Python 3.11/3.12; Docker job будує image, запускає container і чекає HTTP 200 /health. Wheel/sdist завантажуються як workflow artifact.</w:t>
+        <w:t>Workflow запускається на push main і pull_request. Quality job використовує matrix Python 3.11/3.12; Docker job будує image, запускає container і чекає HTTP 200 /health. Wheel/sdist завантажуються як workflow artifact. Фінальний run #3 для commit 2d2b4cc завершився зі статусом Success за 41 секунду.</w:t>
       </w:r>
     </w:p>
     <w:tbl>
@@ -1763,6 +1763,56 @@
         </w:tc>
       </w:tr>
     </w:tbl>
+    <w:p>
+      <w:pPr>
+        <w:jc w:val="center"/>
+      </w:pPr>
+      <w:r>
+        <w:drawing>
+          <wp:inline xmlns:a="http://schemas.openxmlformats.org/drawingml/2006/main" xmlns:pic="http://schemas.openxmlformats.org/drawingml/2006/picture">
+            <wp:extent cx="5760000" cy="1627200"/>
+            <wp:docPr id="5" name="Picture 5" title="Рисунок 5 - green GitHub Actions pipeline" descr="Успішні quality matrix і Docker production image jobs"/>
+            <wp:cNvGraphicFramePr>
+              <a:graphicFrameLocks noChangeAspect="1"/>
+            </wp:cNvGraphicFramePr>
+            <a:graphic>
+              <a:graphicData uri="http://schemas.openxmlformats.org/drawingml/2006/picture">
+                <pic:pic>
+                  <pic:nvPicPr>
+                    <pic:cNvPr id="0" name="ci.png"/>
+                    <pic:cNvPicPr/>
+                  </pic:nvPicPr>
+                  <pic:blipFill>
+                    <a:blip r:embed="rId14"/>
+                    <a:stretch>
+                      <a:fillRect/>
+                    </a:stretch>
+                  </pic:blipFill>
+                  <pic:spPr>
+                    <a:xfrm>
+                      <a:off x="0" y="0"/>
+                      <a:ext cx="5760000" cy="1627200"/>
+                    </a:xfrm>
+                    <a:prstGeom prst="rect"/>
+                  </pic:spPr>
+                </pic:pic>
+              </a:graphicData>
+            </a:graphic>
+          </wp:inline>
+        </w:drawing>
+      </w:r>
+    </w:p>
+    <w:p>
+      <w:pPr>
+        <w:jc w:val="center"/>
+      </w:pPr>
+      <w:r>
+        <w:rPr>
+          <w:i/>
+        </w:rPr>
+        <w:t>Рисунок 5 - green GitHub Actions pipeline</w:t>
+      </w:r>
+    </w:p>
     <w:p>
       <w:r>
         <w:br w:type="page"/>

</xml_diff>